<commit_message>
docs: agrega informes en pdf y docx
</commit_message>
<xml_diff>
--- a/semana2/docs/sumativa2_validacion_simulacion_remuestreo.docx
+++ b/semana2/docs/sumativa2_validacion_simulacion_remuestreo.docx
@@ -584,7 +584,7 @@
         <w:pStyle w:val="Ttulo1"/>
       </w:pPr>
       <w:bookmarkStart w:id="0" w:name="_Toc234078070"/>
-      <w:bookmarkStart w:id="1" w:name="_Toc234161589"/>
+      <w:bookmarkStart w:id="1" w:name="_Toc234442560"/>
       <w:r>
         <w:lastRenderedPageBreak/>
         <w:t>1.- Índice</w:t>
@@ -645,7 +645,7 @@
           <w:r>
             <w:fldChar w:fldCharType="separate"/>
           </w:r>
-          <w:hyperlink w:anchor="_Toc234161589" w:history="1">
+          <w:hyperlink w:anchor="_Toc234442560" w:history="1">
             <w:r>
               <w:rPr>
                 <w:rStyle w:val="Hipervnculo"/>
@@ -672,7 +672,7 @@
                 <w:noProof/>
                 <w:webHidden/>
               </w:rPr>
-              <w:instrText xml:space="preserve"> PAGEREF _Toc234161589 \h </w:instrText>
+              <w:instrText xml:space="preserve"> PAGEREF _Toc234442560 \h </w:instrText>
             </w:r>
             <w:r>
               <w:rPr>
@@ -719,7 +719,7 @@
               <w14:ligatures w14:val="standardContextual"/>
             </w:rPr>
           </w:pPr>
-          <w:hyperlink w:anchor="_Toc234161590" w:history="1">
+          <w:hyperlink w:anchor="_Toc234442561" w:history="1">
             <w:r>
               <w:rPr>
                 <w:rStyle w:val="Hipervnculo"/>
@@ -746,7 +746,7 @@
                 <w:noProof/>
                 <w:webHidden/>
               </w:rPr>
-              <w:instrText xml:space="preserve"> PAGEREF _Toc234161590 \h </w:instrText>
+              <w:instrText xml:space="preserve"> PAGEREF _Toc234442561 \h </w:instrText>
             </w:r>
             <w:r>
               <w:rPr>
@@ -793,7 +793,7 @@
               <w14:ligatures w14:val="standardContextual"/>
             </w:rPr>
           </w:pPr>
-          <w:hyperlink w:anchor="_Toc234161591" w:history="1">
+          <w:hyperlink w:anchor="_Toc234442562" w:history="1">
             <w:r>
               <w:rPr>
                 <w:rStyle w:val="Hipervnculo"/>
@@ -820,7 +820,7 @@
                 <w:noProof/>
                 <w:webHidden/>
               </w:rPr>
-              <w:instrText xml:space="preserve"> PAGEREF _Toc234161591 \h </w:instrText>
+              <w:instrText xml:space="preserve"> PAGEREF _Toc234442562 \h </w:instrText>
             </w:r>
             <w:r>
               <w:rPr>
@@ -867,7 +867,7 @@
               <w14:ligatures w14:val="standardContextual"/>
             </w:rPr>
           </w:pPr>
-          <w:hyperlink w:anchor="_Toc234161592" w:history="1">
+          <w:hyperlink w:anchor="_Toc234442563" w:history="1">
             <w:r>
               <w:rPr>
                 <w:rStyle w:val="Hipervnculo"/>
@@ -894,7 +894,7 @@
                 <w:noProof/>
                 <w:webHidden/>
               </w:rPr>
-              <w:instrText xml:space="preserve"> PAGEREF _Toc234161592 \h </w:instrText>
+              <w:instrText xml:space="preserve"> PAGEREF _Toc234442563 \h </w:instrText>
             </w:r>
             <w:r>
               <w:rPr>
@@ -941,13 +941,13 @@
               <w14:ligatures w14:val="standardContextual"/>
             </w:rPr>
           </w:pPr>
-          <w:hyperlink w:anchor="_Toc234161593" w:history="1">
+          <w:hyperlink w:anchor="_Toc234442564" w:history="1">
             <w:r>
               <w:rPr>
                 <w:rStyle w:val="Hipervnculo"/>
                 <w:noProof/>
               </w:rPr>
-              <w:t>5.- Valuación de estabilidad de correlaciones</w:t>
+              <w:t>5.- Evaluación de estabilidad de correlaciones</w:t>
             </w:r>
             <w:r>
               <w:rPr>
@@ -968,7 +968,7 @@
                 <w:noProof/>
                 <w:webHidden/>
               </w:rPr>
-              <w:instrText xml:space="preserve"> PAGEREF _Toc234161593 \h </w:instrText>
+              <w:instrText xml:space="preserve"> PAGEREF _Toc234442564 \h </w:instrText>
             </w:r>
             <w:r>
               <w:rPr>
@@ -988,7 +988,7 @@
                 <w:noProof/>
                 <w:webHidden/>
               </w:rPr>
-              <w:t>4</w:t>
+              <w:t>5</w:t>
             </w:r>
             <w:r>
               <w:rPr>
@@ -1015,7 +1015,7 @@
               <w14:ligatures w14:val="standardContextual"/>
             </w:rPr>
           </w:pPr>
-          <w:hyperlink w:anchor="_Toc234161594" w:history="1">
+          <w:hyperlink w:anchor="_Toc234442565" w:history="1">
             <w:r>
               <w:rPr>
                 <w:rStyle w:val="Hipervnculo"/>
@@ -1042,7 +1042,7 @@
                 <w:noProof/>
                 <w:webHidden/>
               </w:rPr>
-              <w:instrText xml:space="preserve"> PAGEREF _Toc234161594 \h </w:instrText>
+              <w:instrText xml:space="preserve"> PAGEREF _Toc234442565 \h </w:instrText>
             </w:r>
             <w:r>
               <w:rPr>
@@ -1062,7 +1062,81 @@
                 <w:noProof/>
                 <w:webHidden/>
               </w:rPr>
-              <w:t>5</w:t>
+              <w:t>6</w:t>
+            </w:r>
+            <w:r>
+              <w:rPr>
+                <w:noProof/>
+                <w:webHidden/>
+              </w:rPr>
+              <w:fldChar w:fldCharType="end"/>
+            </w:r>
+          </w:hyperlink>
+        </w:p>
+        <w:p>
+          <w:pPr>
+            <w:pStyle w:val="TDC2"/>
+            <w:tabs>
+              <w:tab w:val="right" w:leader="dot" w:pos="9062"/>
+            </w:tabs>
+            <w:rPr>
+              <w:rFonts w:asciiTheme="minorHAnsi" w:eastAsiaTheme="minorEastAsia" w:hAnsiTheme="minorHAnsi" w:cstheme="minorBidi"/>
+              <w:noProof/>
+              <w:color w:val="auto"/>
+              <w:kern w:val="2"/>
+              <w:sz w:val="24"/>
+              <w:szCs w:val="24"/>
+              <w14:ligatures w14:val="standardContextual"/>
+            </w:rPr>
+          </w:pPr>
+          <w:hyperlink w:anchor="_Toc234442566" w:history="1">
+            <w:r>
+              <w:rPr>
+                <w:rStyle w:val="Hipervnculo"/>
+                <w:noProof/>
+              </w:rPr>
+              <w:t>6.1.- Simulación Monte Carlo Sensibilidad de parámetros de entrada</w:t>
+            </w:r>
+            <w:r>
+              <w:rPr>
+                <w:noProof/>
+                <w:webHidden/>
+              </w:rPr>
+              <w:tab/>
+            </w:r>
+            <w:r>
+              <w:rPr>
+                <w:noProof/>
+                <w:webHidden/>
+              </w:rPr>
+              <w:fldChar w:fldCharType="begin"/>
+            </w:r>
+            <w:r>
+              <w:rPr>
+                <w:noProof/>
+                <w:webHidden/>
+              </w:rPr>
+              <w:instrText xml:space="preserve"> PAGEREF _Toc234442566 \h </w:instrText>
+            </w:r>
+            <w:r>
+              <w:rPr>
+                <w:noProof/>
+                <w:webHidden/>
+              </w:rPr>
+            </w:r>
+            <w:r>
+              <w:rPr>
+                <w:noProof/>
+                <w:webHidden/>
+              </w:rPr>
+              <w:fldChar w:fldCharType="separate"/>
+            </w:r>
+            <w:r>
+              <w:rPr>
+                <w:noProof/>
+                <w:webHidden/>
+              </w:rPr>
+              <w:t>7</w:t>
             </w:r>
             <w:r>
               <w:rPr>
@@ -1089,13 +1163,13 @@
               <w14:ligatures w14:val="standardContextual"/>
             </w:rPr>
           </w:pPr>
-          <w:hyperlink w:anchor="_Toc234161595" w:history="1">
+          <w:hyperlink w:anchor="_Toc234442567" w:history="1">
             <w:r>
               <w:rPr>
                 <w:rStyle w:val="Hipervnculo"/>
                 <w:noProof/>
               </w:rPr>
-              <w:t>7.- Simulación Monte Carlo Sensibilidad de parámetros de entrada</w:t>
+              <w:t>8.- Análisis de robustez</w:t>
             </w:r>
             <w:r>
               <w:rPr>
@@ -1116,7 +1190,7 @@
                 <w:noProof/>
                 <w:webHidden/>
               </w:rPr>
-              <w:instrText xml:space="preserve"> PAGEREF _Toc234161595 \h </w:instrText>
+              <w:instrText xml:space="preserve"> PAGEREF _Toc234442567 \h </w:instrText>
             </w:r>
             <w:r>
               <w:rPr>
@@ -1136,7 +1210,7 @@
                 <w:noProof/>
                 <w:webHidden/>
               </w:rPr>
-              <w:t>6</w:t>
+              <w:t>7</w:t>
             </w:r>
             <w:r>
               <w:rPr>
@@ -1163,13 +1237,13 @@
               <w14:ligatures w14:val="standardContextual"/>
             </w:rPr>
           </w:pPr>
-          <w:hyperlink w:anchor="_Toc234161596" w:history="1">
+          <w:hyperlink w:anchor="_Toc234442568" w:history="1">
             <w:r>
               <w:rPr>
                 <w:rStyle w:val="Hipervnculo"/>
                 <w:noProof/>
               </w:rPr>
-              <w:t>8.- Análisis de robustez</w:t>
+              <w:t>9.- Preparación para la Sumativa 3</w:t>
             </w:r>
             <w:r>
               <w:rPr>
@@ -1190,7 +1264,7 @@
                 <w:noProof/>
                 <w:webHidden/>
               </w:rPr>
-              <w:instrText xml:space="preserve"> PAGEREF _Toc234161596 \h </w:instrText>
+              <w:instrText xml:space="preserve"> PAGEREF _Toc234442568 \h </w:instrText>
             </w:r>
             <w:r>
               <w:rPr>
@@ -1210,7 +1284,7 @@
                 <w:noProof/>
                 <w:webHidden/>
               </w:rPr>
-              <w:t>7</w:t>
+              <w:t>8</w:t>
             </w:r>
             <w:r>
               <w:rPr>
@@ -1237,13 +1311,13 @@
               <w14:ligatures w14:val="standardContextual"/>
             </w:rPr>
           </w:pPr>
-          <w:hyperlink w:anchor="_Toc234161597" w:history="1">
+          <w:hyperlink w:anchor="_Toc234442569" w:history="1">
             <w:r>
               <w:rPr>
                 <w:rStyle w:val="Hipervnculo"/>
                 <w:noProof/>
               </w:rPr>
-              <w:t>9.- Preparación para la Sumativa 3</w:t>
+              <w:t>10.- Bibliografía (APA 7)</w:t>
             </w:r>
             <w:r>
               <w:rPr>
@@ -1264,7 +1338,7 @@
                 <w:noProof/>
                 <w:webHidden/>
               </w:rPr>
-              <w:instrText xml:space="preserve"> PAGEREF _Toc234161597 \h </w:instrText>
+              <w:instrText xml:space="preserve"> PAGEREF _Toc234442569 \h </w:instrText>
             </w:r>
             <w:r>
               <w:rPr>
@@ -1284,81 +1358,7 @@
                 <w:noProof/>
                 <w:webHidden/>
               </w:rPr>
-              <w:t>7</w:t>
-            </w:r>
-            <w:r>
-              <w:rPr>
-                <w:noProof/>
-                <w:webHidden/>
-              </w:rPr>
-              <w:fldChar w:fldCharType="end"/>
-            </w:r>
-          </w:hyperlink>
-        </w:p>
-        <w:p>
-          <w:pPr>
-            <w:pStyle w:val="TDC1"/>
-            <w:tabs>
-              <w:tab w:val="right" w:leader="dot" w:pos="9062"/>
-            </w:tabs>
-            <w:rPr>
-              <w:rFonts w:asciiTheme="minorHAnsi" w:eastAsiaTheme="minorEastAsia" w:hAnsiTheme="minorHAnsi" w:cstheme="minorBidi"/>
-              <w:noProof/>
-              <w:color w:val="auto"/>
-              <w:kern w:val="2"/>
-              <w:sz w:val="24"/>
-              <w:szCs w:val="24"/>
-              <w14:ligatures w14:val="standardContextual"/>
-            </w:rPr>
-          </w:pPr>
-          <w:hyperlink w:anchor="_Toc234161598" w:history="1">
-            <w:r>
-              <w:rPr>
-                <w:rStyle w:val="Hipervnculo"/>
-                <w:noProof/>
-              </w:rPr>
-              <w:t>10.- Bibliografía (APA 7)</w:t>
-            </w:r>
-            <w:r>
-              <w:rPr>
-                <w:noProof/>
-                <w:webHidden/>
-              </w:rPr>
-              <w:tab/>
-            </w:r>
-            <w:r>
-              <w:rPr>
-                <w:noProof/>
-                <w:webHidden/>
-              </w:rPr>
-              <w:fldChar w:fldCharType="begin"/>
-            </w:r>
-            <w:r>
-              <w:rPr>
-                <w:noProof/>
-                <w:webHidden/>
-              </w:rPr>
-              <w:instrText xml:space="preserve"> PAGEREF _Toc234161598 \h </w:instrText>
-            </w:r>
-            <w:r>
-              <w:rPr>
-                <w:noProof/>
-                <w:webHidden/>
-              </w:rPr>
-            </w:r>
-            <w:r>
-              <w:rPr>
-                <w:noProof/>
-                <w:webHidden/>
-              </w:rPr>
-              <w:fldChar w:fldCharType="separate"/>
-            </w:r>
-            <w:r>
-              <w:rPr>
-                <w:noProof/>
-                <w:webHidden/>
-              </w:rPr>
-              <w:t>8</w:t>
+              <w:t>9</w:t>
             </w:r>
             <w:r>
               <w:rPr>
@@ -1403,7 +1403,7 @@
       <w:pPr>
         <w:pStyle w:val="Ttulo1"/>
       </w:pPr>
-      <w:bookmarkStart w:id="3" w:name="_Toc234161590"/>
+      <w:bookmarkStart w:id="3" w:name="_Toc234442561"/>
       <w:r>
         <w:lastRenderedPageBreak/>
         <w:t>2</w:t>
@@ -2708,7 +2708,7 @@
       <w:pPr>
         <w:pStyle w:val="Ttulo1"/>
       </w:pPr>
-      <w:bookmarkStart w:id="4" w:name="_Toc234161591"/>
+      <w:bookmarkStart w:id="4" w:name="_Toc234442562"/>
       <w:r>
         <w:t>3</w:t>
       </w:r>
@@ -6844,7 +6844,7 @@
       <w:pPr>
         <w:pStyle w:val="Ttulo1"/>
       </w:pPr>
-      <w:bookmarkStart w:id="6" w:name="_Toc234161592"/>
+      <w:bookmarkStart w:id="6" w:name="_Toc234442563"/>
       <w:r>
         <w:t>4</w:t>
       </w:r>
@@ -8130,7 +8130,7 @@
       <w:pPr>
         <w:pStyle w:val="Ttulo1"/>
       </w:pPr>
-      <w:bookmarkStart w:id="8" w:name="_Toc234161593"/>
+      <w:bookmarkStart w:id="8" w:name="_Toc234442564"/>
       <w:r>
         <w:t>5</w:t>
       </w:r>
@@ -10292,7 +10292,7 @@
       <w:pPr>
         <w:pStyle w:val="Ttulo1"/>
       </w:pPr>
-      <w:bookmarkStart w:id="10" w:name="_Toc234161594"/>
+      <w:bookmarkStart w:id="10" w:name="_Toc234442565"/>
       <w:r>
         <w:t>6</w:t>
       </w:r>
@@ -10982,7 +10982,7 @@
       <w:pPr>
         <w:pStyle w:val="Ttulo2"/>
       </w:pPr>
-      <w:bookmarkStart w:id="11" w:name="_Toc234161595"/>
+      <w:bookmarkStart w:id="11" w:name="_Toc234442566"/>
       <w:r>
         <w:lastRenderedPageBreak/>
         <w:t>6.1</w:t>
@@ -12421,9 +12421,9 @@
         <w:pStyle w:val="Ttulo1"/>
       </w:pPr>
       <w:bookmarkStart w:id="12" w:name="_Toc234078075"/>
-      <w:bookmarkStart w:id="13" w:name="_Toc234161596"/>
-      <w:r>
-        <w:t>8</w:t>
+      <w:bookmarkStart w:id="13" w:name="_Toc234442567"/>
+      <w:r>
+        <w:t>7</w:t>
       </w:r>
       <w:r>
         <w:t xml:space="preserve">.- </w:t>
@@ -14078,9 +14078,9 @@
       <w:pPr>
         <w:pStyle w:val="Ttulo1"/>
       </w:pPr>
-      <w:bookmarkStart w:id="15" w:name="_Toc234161597"/>
-      <w:r>
-        <w:t>9</w:t>
+      <w:bookmarkStart w:id="15" w:name="_Toc234442568"/>
+      <w:r>
+        <w:t>8</w:t>
       </w:r>
       <w:r>
         <w:t xml:space="preserve">.- </w:t>
@@ -16638,9 +16638,9 @@
         <w:pStyle w:val="Ttulo1"/>
       </w:pPr>
       <w:bookmarkStart w:id="16" w:name="_Toc234078077"/>
-      <w:bookmarkStart w:id="17" w:name="_Toc234161598"/>
-      <w:r>
-        <w:t>10</w:t>
+      <w:bookmarkStart w:id="17" w:name="_Toc234442569"/>
+      <w:r>
+        <w:t>9</w:t>
       </w:r>
       <w:r>
         <w:t xml:space="preserve">.- </w:t>
@@ -16766,7 +16766,21 @@
           <w:i/>
           <w:iCs/>
         </w:rPr>
-        <w:t>Grupo 6. (2026). mcdia500-estadistica-computacional-g6: Semana 1 y Semana 2 [Repositorio GitHub].</w:t>
+        <w:t>Grupo 6. (2026). mcdia50</w:t>
+      </w:r>
+      <w:r>
+        <w:rPr>
+          <w:i/>
+          <w:iCs/>
+        </w:rPr>
+        <w:t>1</w:t>
+      </w:r>
+      <w:r>
+        <w:rPr>
+          <w:i/>
+          <w:iCs/>
+        </w:rPr>
+        <w:t>-estadistica-computacional-g6: Semana 1 y Semana 2 [Repositorio GitHub].</w:t>
       </w:r>
     </w:p>
     <w:p>

</xml_diff>